<commit_message>
DER, script e Quiz atualizado
</commit_message>
<xml_diff>
--- a/TI/Documentação Projeto Pessoal.docx
+++ b/TI/Documentação Projeto Pessoal.docx
@@ -90,7 +90,39 @@
           <w:sz w:val="28"/>
           <w:szCs w:val="28"/>
         </w:rPr>
-        <w:t xml:space="preserve"> japonês do mangaka (autor) Eichiiro </w:t>
+        <w:t xml:space="preserve"> japonês do </w:t>
+      </w:r>
+      <w:proofErr w:type="spellStart"/>
+      <w:r>
+        <w:rPr>
+          <w:sz w:val="28"/>
+          <w:szCs w:val="28"/>
+        </w:rPr>
+        <w:t>mangaka</w:t>
+      </w:r>
+      <w:proofErr w:type="spellEnd"/>
+      <w:r>
+        <w:rPr>
+          <w:sz w:val="28"/>
+          <w:szCs w:val="28"/>
+        </w:rPr>
+        <w:t xml:space="preserve"> (autor) </w:t>
+      </w:r>
+      <w:proofErr w:type="spellStart"/>
+      <w:r>
+        <w:rPr>
+          <w:sz w:val="28"/>
+          <w:szCs w:val="28"/>
+        </w:rPr>
+        <w:t>Eichiiro</w:t>
+      </w:r>
+      <w:proofErr w:type="spellEnd"/>
+      <w:r>
+        <w:rPr>
+          <w:sz w:val="28"/>
+          <w:szCs w:val="28"/>
+        </w:rPr>
+        <w:t xml:space="preserve"> </w:t>
       </w:r>
       <w:r>
         <w:rPr>
@@ -111,7 +143,23 @@
           <w:sz w:val="28"/>
           <w:szCs w:val="28"/>
         </w:rPr>
-        <w:t xml:space="preserve"> sendo publicado na revista Weekly Shonen Jump. </w:t>
+        <w:t xml:space="preserve"> sendo publicado na revista Weekly </w:t>
+      </w:r>
+      <w:proofErr w:type="spellStart"/>
+      <w:r>
+        <w:rPr>
+          <w:sz w:val="28"/>
+          <w:szCs w:val="28"/>
+        </w:rPr>
+        <w:t>Shonen</w:t>
+      </w:r>
+      <w:proofErr w:type="spellEnd"/>
+      <w:r>
+        <w:rPr>
+          <w:sz w:val="28"/>
+          <w:szCs w:val="28"/>
+        </w:rPr>
+        <w:t xml:space="preserve"> Jump. </w:t>
       </w:r>
       <w:r>
         <w:rPr>
@@ -174,7 +222,23 @@
           <w:sz w:val="28"/>
           <w:szCs w:val="28"/>
         </w:rPr>
-        <w:t>em forma de anime. A obra de ficção de Eichiiro Oda se tornou um fenômeno mundial</w:t>
+        <w:t xml:space="preserve">em forma de anime. A obra de ficção de </w:t>
+      </w:r>
+      <w:proofErr w:type="spellStart"/>
+      <w:r>
+        <w:rPr>
+          <w:sz w:val="28"/>
+          <w:szCs w:val="28"/>
+        </w:rPr>
+        <w:t>Eichiiro</w:t>
+      </w:r>
+      <w:proofErr w:type="spellEnd"/>
+      <w:r>
+        <w:rPr>
+          <w:sz w:val="28"/>
+          <w:szCs w:val="28"/>
+        </w:rPr>
+        <w:t xml:space="preserve"> Oda se tornou um fenômeno mundial</w:t>
       </w:r>
       <w:r>
         <w:rPr>
@@ -230,7 +294,23 @@
           <w:sz w:val="28"/>
           <w:szCs w:val="28"/>
         </w:rPr>
-        <w:t xml:space="preserve"> Batman. A obra de Eiichiro Oda continua a crescer, aproximando-se do recorde de quadrinhos mais vendidos do mundo. </w:t>
+        <w:t xml:space="preserve"> Batman. A obra de </w:t>
+      </w:r>
+      <w:proofErr w:type="spellStart"/>
+      <w:r>
+        <w:rPr>
+          <w:sz w:val="28"/>
+          <w:szCs w:val="28"/>
+        </w:rPr>
+        <w:t>Eiichiro</w:t>
+      </w:r>
+      <w:proofErr w:type="spellEnd"/>
+      <w:r>
+        <w:rPr>
+          <w:sz w:val="28"/>
+          <w:szCs w:val="28"/>
+        </w:rPr>
+        <w:t xml:space="preserve"> Oda continua a crescer, aproximando-se do recorde de quadrinhos mais vendidos do mundo. </w:t>
       </w:r>
       <w:r>
         <w:rPr>
@@ -380,7 +460,39 @@
           <w:sz w:val="28"/>
           <w:szCs w:val="28"/>
         </w:rPr>
-        <w:t>gira em torno de Monkey D. Luffy e sua tripulação</w:t>
+        <w:t xml:space="preserve">gira em torno de </w:t>
+      </w:r>
+      <w:proofErr w:type="spellStart"/>
+      <w:r>
+        <w:rPr>
+          <w:sz w:val="28"/>
+          <w:szCs w:val="28"/>
+        </w:rPr>
+        <w:t>Monkey</w:t>
+      </w:r>
+      <w:proofErr w:type="spellEnd"/>
+      <w:r>
+        <w:rPr>
+          <w:sz w:val="28"/>
+          <w:szCs w:val="28"/>
+        </w:rPr>
+        <w:t xml:space="preserve"> D. </w:t>
+      </w:r>
+      <w:proofErr w:type="spellStart"/>
+      <w:r>
+        <w:rPr>
+          <w:sz w:val="28"/>
+          <w:szCs w:val="28"/>
+        </w:rPr>
+        <w:t>Luffy</w:t>
+      </w:r>
+      <w:proofErr w:type="spellEnd"/>
+      <w:r>
+        <w:rPr>
+          <w:sz w:val="28"/>
+          <w:szCs w:val="28"/>
+        </w:rPr>
+        <w:t xml:space="preserve"> e sua tripulação</w:t>
       </w:r>
       <w:r>
         <w:rPr>
@@ -600,7 +712,23 @@
           <w:sz w:val="28"/>
           <w:szCs w:val="28"/>
         </w:rPr>
-        <w:t xml:space="preserve"> através de backstories (</w:t>
+        <w:t xml:space="preserve"> através de </w:t>
+      </w:r>
+      <w:proofErr w:type="spellStart"/>
+      <w:r>
+        <w:rPr>
+          <w:sz w:val="28"/>
+          <w:szCs w:val="28"/>
+        </w:rPr>
+        <w:t>backstories</w:t>
+      </w:r>
+      <w:proofErr w:type="spellEnd"/>
+      <w:r>
+        <w:rPr>
+          <w:sz w:val="28"/>
+          <w:szCs w:val="28"/>
+        </w:rPr>
+        <w:t xml:space="preserve"> (</w:t>
       </w:r>
       <w:r>
         <w:rPr>
@@ -702,7 +830,23 @@
           <w:sz w:val="28"/>
           <w:szCs w:val="28"/>
         </w:rPr>
-        <w:t xml:space="preserve"> Eichiro Oda faz uma correlação com o racismo sofrido pelas pessoas negras em detrimento dos anos de escravidão</w:t>
+        <w:t xml:space="preserve"> </w:t>
+      </w:r>
+      <w:proofErr w:type="spellStart"/>
+      <w:r>
+        <w:rPr>
+          <w:sz w:val="28"/>
+          <w:szCs w:val="28"/>
+        </w:rPr>
+        <w:t>Eichiro</w:t>
+      </w:r>
+      <w:proofErr w:type="spellEnd"/>
+      <w:r>
+        <w:rPr>
+          <w:sz w:val="28"/>
+          <w:szCs w:val="28"/>
+        </w:rPr>
+        <w:t xml:space="preserve"> Oda faz uma correlação com o racismo sofrido pelas pessoas negras em detrimento dos anos de escravidão</w:t>
       </w:r>
       <w:r>
         <w:rPr>
@@ -723,7 +867,23 @@
           <w:sz w:val="28"/>
           <w:szCs w:val="28"/>
         </w:rPr>
-        <w:t xml:space="preserve"> há duas figuras importantes: Fisher Tiger e Queen Otohime, que representam </w:t>
+        <w:t xml:space="preserve"> há duas figuras importantes: Fisher Tiger e Queen </w:t>
+      </w:r>
+      <w:proofErr w:type="spellStart"/>
+      <w:r>
+        <w:rPr>
+          <w:sz w:val="28"/>
+          <w:szCs w:val="28"/>
+        </w:rPr>
+        <w:t>Otohime</w:t>
+      </w:r>
+      <w:proofErr w:type="spellEnd"/>
+      <w:r>
+        <w:rPr>
+          <w:sz w:val="28"/>
+          <w:szCs w:val="28"/>
+        </w:rPr>
+        <w:t xml:space="preserve">, que representam </w:t>
       </w:r>
       <w:r>
         <w:rPr>
@@ -834,7 +994,23 @@
           <w:sz w:val="28"/>
           <w:szCs w:val="28"/>
         </w:rPr>
-        <w:t>os segmentos midiáticos como por exemplo o Live Action produzido pela Netflix</w:t>
+        <w:t xml:space="preserve">os segmentos midiáticos como por exemplo o Live </w:t>
+      </w:r>
+      <w:proofErr w:type="spellStart"/>
+      <w:r>
+        <w:rPr>
+          <w:sz w:val="28"/>
+          <w:szCs w:val="28"/>
+        </w:rPr>
+        <w:t>Action</w:t>
+      </w:r>
+      <w:proofErr w:type="spellEnd"/>
+      <w:r>
+        <w:rPr>
+          <w:sz w:val="28"/>
+          <w:szCs w:val="28"/>
+        </w:rPr>
+        <w:t xml:space="preserve"> produzido pela Netflix</w:t>
       </w:r>
       <w:r>
         <w:rPr>
@@ -876,8 +1052,17 @@
           <w:sz w:val="28"/>
           <w:szCs w:val="28"/>
         </w:rPr>
-        <w:t xml:space="preserve"> em collabs</w:t>
-      </w:r>
+        <w:t xml:space="preserve"> em </w:t>
+      </w:r>
+      <w:proofErr w:type="spellStart"/>
+      <w:r>
+        <w:rPr>
+          <w:sz w:val="28"/>
+          <w:szCs w:val="28"/>
+        </w:rPr>
+        <w:t>collabs</w:t>
+      </w:r>
+      <w:proofErr w:type="spellEnd"/>
       <w:r>
         <w:rPr>
           <w:sz w:val="28"/>
@@ -1059,12 +1244,37 @@
         </w:rPr>
         <w:t xml:space="preserve">Figura 1– </w:t>
       </w:r>
-      <w:r>
-        <w:rPr>
-          <w:sz w:val="28"/>
-          <w:szCs w:val="28"/>
-        </w:rPr>
-        <w:t>One Piece Live Action produzido pela Netflix</w:t>
+      <w:proofErr w:type="spellStart"/>
+      <w:r>
+        <w:rPr>
+          <w:sz w:val="28"/>
+          <w:szCs w:val="28"/>
+        </w:rPr>
+        <w:t>One</w:t>
+      </w:r>
+      <w:proofErr w:type="spellEnd"/>
+      <w:r>
+        <w:rPr>
+          <w:sz w:val="28"/>
+          <w:szCs w:val="28"/>
+        </w:rPr>
+        <w:t xml:space="preserve"> Piece Live </w:t>
+      </w:r>
+      <w:proofErr w:type="spellStart"/>
+      <w:r>
+        <w:rPr>
+          <w:sz w:val="28"/>
+          <w:szCs w:val="28"/>
+        </w:rPr>
+        <w:t>Action</w:t>
+      </w:r>
+      <w:proofErr w:type="spellEnd"/>
+      <w:r>
+        <w:rPr>
+          <w:sz w:val="28"/>
+          <w:szCs w:val="28"/>
+        </w:rPr>
+        <w:t xml:space="preserve"> produzido pela Netflix</w:t>
       </w:r>
     </w:p>
     <w:p>
@@ -1163,12 +1373,37 @@
         </w:rPr>
         <w:t xml:space="preserve">Figura 2- </w:t>
       </w:r>
-      <w:r>
-        <w:rPr>
-          <w:sz w:val="28"/>
-          <w:szCs w:val="28"/>
-        </w:rPr>
-        <w:t>One Piece collab com Lakers</w:t>
+      <w:proofErr w:type="spellStart"/>
+      <w:r>
+        <w:rPr>
+          <w:sz w:val="28"/>
+          <w:szCs w:val="28"/>
+        </w:rPr>
+        <w:t>One</w:t>
+      </w:r>
+      <w:proofErr w:type="spellEnd"/>
+      <w:r>
+        <w:rPr>
+          <w:sz w:val="28"/>
+          <w:szCs w:val="28"/>
+        </w:rPr>
+        <w:t xml:space="preserve"> Piece </w:t>
+      </w:r>
+      <w:proofErr w:type="spellStart"/>
+      <w:r>
+        <w:rPr>
+          <w:sz w:val="28"/>
+          <w:szCs w:val="28"/>
+        </w:rPr>
+        <w:t>collab</w:t>
+      </w:r>
+      <w:proofErr w:type="spellEnd"/>
+      <w:r>
+        <w:rPr>
+          <w:sz w:val="28"/>
+          <w:szCs w:val="28"/>
+        </w:rPr>
+        <w:t xml:space="preserve"> com Lakers</w:t>
       </w:r>
     </w:p>
     <w:p>
@@ -1447,7 +1682,23 @@
           <w:sz w:val="28"/>
           <w:szCs w:val="28"/>
         </w:rPr>
-        <w:t xml:space="preserve">dos personagens, sendo a primeira que mais me marcou foi a do Chopper, resumidamente, é a </w:t>
+        <w:t xml:space="preserve">dos personagens, sendo a primeira que mais me marcou foi a do </w:t>
+      </w:r>
+      <w:proofErr w:type="spellStart"/>
+      <w:r>
+        <w:rPr>
+          <w:sz w:val="28"/>
+          <w:szCs w:val="28"/>
+        </w:rPr>
+        <w:t>Chopper</w:t>
+      </w:r>
+      <w:proofErr w:type="spellEnd"/>
+      <w:r>
+        <w:rPr>
+          <w:sz w:val="28"/>
+          <w:szCs w:val="28"/>
+        </w:rPr>
+        <w:t xml:space="preserve">, resumidamente, é a </w:t>
       </w:r>
       <w:r>
         <w:rPr>
@@ -1496,7 +1747,39 @@
           <w:sz w:val="28"/>
           <w:szCs w:val="28"/>
         </w:rPr>
-        <w:t xml:space="preserve"> Hito Hito no Mi</w:t>
+        <w:t xml:space="preserve"> </w:t>
+      </w:r>
+      <w:proofErr w:type="spellStart"/>
+      <w:r>
+        <w:rPr>
+          <w:sz w:val="28"/>
+          <w:szCs w:val="28"/>
+        </w:rPr>
+        <w:t>Hito</w:t>
+      </w:r>
+      <w:proofErr w:type="spellEnd"/>
+      <w:r>
+        <w:rPr>
+          <w:sz w:val="28"/>
+          <w:szCs w:val="28"/>
+        </w:rPr>
+        <w:t xml:space="preserve"> </w:t>
+      </w:r>
+      <w:proofErr w:type="spellStart"/>
+      <w:r>
+        <w:rPr>
+          <w:sz w:val="28"/>
+          <w:szCs w:val="28"/>
+        </w:rPr>
+        <w:t>Hito</w:t>
+      </w:r>
+      <w:proofErr w:type="spellEnd"/>
+      <w:r>
+        <w:rPr>
+          <w:sz w:val="28"/>
+          <w:szCs w:val="28"/>
+        </w:rPr>
+        <w:t xml:space="preserve"> no Mi</w:t>
       </w:r>
       <w:r>
         <w:rPr>
@@ -1524,7 +1807,23 @@
           <w:sz w:val="28"/>
           <w:szCs w:val="28"/>
         </w:rPr>
-        <w:t xml:space="preserve">, este foi expulso da matilha. Após uma tentativa falha de Chopper de se comunicar com os humanos por conta do medo destes, o personagem passa um tempo </w:t>
+        <w:t xml:space="preserve">, este foi expulso da matilha. Após uma tentativa falha de </w:t>
+      </w:r>
+      <w:proofErr w:type="spellStart"/>
+      <w:r>
+        <w:rPr>
+          <w:sz w:val="28"/>
+          <w:szCs w:val="28"/>
+        </w:rPr>
+        <w:t>Chopper</w:t>
+      </w:r>
+      <w:proofErr w:type="spellEnd"/>
+      <w:r>
+        <w:rPr>
+          <w:sz w:val="28"/>
+          <w:szCs w:val="28"/>
+        </w:rPr>
+        <w:t xml:space="preserve"> de se comunicar com os humanos por conta do medo destes, o personagem passa um tempo </w:t>
       </w:r>
       <w:r>
         <w:rPr>
@@ -1560,7 +1859,23 @@
           <w:sz w:val="28"/>
           <w:szCs w:val="28"/>
         </w:rPr>
-        <w:t xml:space="preserve"> ótica que os outros tem deles, onde o Chopper é tratado como um monstro e o pai como um médico fajuto.</w:t>
+        <w:t xml:space="preserve"> ótica que os outros tem deles, onde o </w:t>
+      </w:r>
+      <w:proofErr w:type="spellStart"/>
+      <w:r>
+        <w:rPr>
+          <w:sz w:val="28"/>
+          <w:szCs w:val="28"/>
+        </w:rPr>
+        <w:t>Chopper</w:t>
+      </w:r>
+      <w:proofErr w:type="spellEnd"/>
+      <w:r>
+        <w:rPr>
+          <w:sz w:val="28"/>
+          <w:szCs w:val="28"/>
+        </w:rPr>
+        <w:t xml:space="preserve"> é tratado como um monstro e o pai como um médico fajuto.</w:t>
       </w:r>
     </w:p>
     <w:p>
@@ -1576,14 +1891,39 @@
           <w:sz w:val="28"/>
           <w:szCs w:val="28"/>
         </w:rPr>
-        <w:t>No desenrolar da backstorie</w:t>
-      </w:r>
-      <w:r>
-        <w:rPr>
-          <w:sz w:val="28"/>
-          <w:szCs w:val="28"/>
-        </w:rPr>
-        <w:t xml:space="preserve"> Chopper acaba perdendo seu pai </w:t>
+        <w:t xml:space="preserve">No desenrolar da </w:t>
+      </w:r>
+      <w:proofErr w:type="spellStart"/>
+      <w:r>
+        <w:rPr>
+          <w:sz w:val="28"/>
+          <w:szCs w:val="28"/>
+        </w:rPr>
+        <w:t>backstorie</w:t>
+      </w:r>
+      <w:proofErr w:type="spellEnd"/>
+      <w:r>
+        <w:rPr>
+          <w:sz w:val="28"/>
+          <w:szCs w:val="28"/>
+        </w:rPr>
+        <w:t xml:space="preserve"> </w:t>
+      </w:r>
+      <w:proofErr w:type="spellStart"/>
+      <w:r>
+        <w:rPr>
+          <w:sz w:val="28"/>
+          <w:szCs w:val="28"/>
+        </w:rPr>
+        <w:t>Chopper</w:t>
+      </w:r>
+      <w:proofErr w:type="spellEnd"/>
+      <w:r>
+        <w:rPr>
+          <w:sz w:val="28"/>
+          <w:szCs w:val="28"/>
+        </w:rPr>
+        <w:t xml:space="preserve"> acaba perdendo seu pai </w:t>
       </w:r>
       <w:r>
         <w:rPr>
@@ -1704,7 +2044,23 @@
           <w:sz w:val="28"/>
           <w:szCs w:val="28"/>
         </w:rPr>
-        <w:t xml:space="preserve"> por exemplo as palavras do pai de Chopper sempre me fazem lembrar meu primo que perdi aos 13 anos</w:t>
+        <w:t xml:space="preserve"> por exemplo as palavras do pai de </w:t>
+      </w:r>
+      <w:proofErr w:type="spellStart"/>
+      <w:r>
+        <w:rPr>
+          <w:sz w:val="28"/>
+          <w:szCs w:val="28"/>
+        </w:rPr>
+        <w:t>Chopper</w:t>
+      </w:r>
+      <w:proofErr w:type="spellEnd"/>
+      <w:r>
+        <w:rPr>
+          <w:sz w:val="28"/>
+          <w:szCs w:val="28"/>
+        </w:rPr>
+        <w:t xml:space="preserve"> sempre me fazem lembrar meu primo que perdi aos 13 anos</w:t>
       </w:r>
       <w:r>
         <w:rPr>
@@ -2116,6 +2472,7 @@
         </w:rPr>
         <w:t xml:space="preserve"> com cada facção Marinha, </w:t>
       </w:r>
+      <w:proofErr w:type="gramStart"/>
       <w:r>
         <w:rPr>
           <w:sz w:val="28"/>
@@ -2128,7 +2485,15 @@
           <w:sz w:val="28"/>
           <w:szCs w:val="28"/>
         </w:rPr>
-        <w:t xml:space="preserve"> ou Piratas trazendo assim </w:t>
+        <w:t xml:space="preserve"> ou Piratas</w:t>
+      </w:r>
+      <w:proofErr w:type="gramEnd"/>
+      <w:r>
+        <w:rPr>
+          <w:sz w:val="28"/>
+          <w:szCs w:val="28"/>
+        </w:rPr>
+        <w:t xml:space="preserve"> trazendo assim </w:t>
       </w:r>
       <w:r>
         <w:rPr>
@@ -3001,12 +3366,21 @@
           <w:szCs w:val="28"/>
         </w:rPr>
       </w:pPr>
-      <w:r>
-        <w:rPr>
-          <w:sz w:val="28"/>
-          <w:szCs w:val="28"/>
-        </w:rPr>
-        <w:t xml:space="preserve">Navbar com links para acesso </w:t>
+      <w:proofErr w:type="spellStart"/>
+      <w:r>
+        <w:rPr>
+          <w:sz w:val="28"/>
+          <w:szCs w:val="28"/>
+        </w:rPr>
+        <w:t>Navbar</w:t>
+      </w:r>
+      <w:proofErr w:type="spellEnd"/>
+      <w:r>
+        <w:rPr>
+          <w:sz w:val="28"/>
+          <w:szCs w:val="28"/>
+        </w:rPr>
+        <w:t xml:space="preserve"> com links para acesso </w:t>
       </w:r>
       <w:r>
         <w:rPr>
@@ -3196,51 +3570,6 @@
         <w:pStyle w:val="PargrafodaLista"/>
         <w:numPr>
           <w:ilvl w:val="0"/>
-          <w:numId w:val="8"/>
-        </w:numPr>
-        <w:spacing w:after="120"/>
-        <w:jc w:val="both"/>
-        <w:rPr>
-          <w:sz w:val="28"/>
-          <w:szCs w:val="28"/>
-        </w:rPr>
-      </w:pPr>
-      <w:r>
-        <w:rPr>
-          <w:sz w:val="28"/>
-          <w:szCs w:val="28"/>
-        </w:rPr>
-        <w:lastRenderedPageBreak/>
-        <w:t>Footer com informações de contato e institucionais</w:t>
-      </w:r>
-    </w:p>
-    <w:p>
-      <w:pPr>
-        <w:pStyle w:val="PargrafodaLista"/>
-        <w:numPr>
-          <w:ilvl w:val="0"/>
-          <w:numId w:val="8"/>
-        </w:numPr>
-        <w:spacing w:after="120"/>
-        <w:jc w:val="both"/>
-        <w:rPr>
-          <w:sz w:val="28"/>
-          <w:szCs w:val="28"/>
-        </w:rPr>
-      </w:pPr>
-      <w:r>
-        <w:rPr>
-          <w:sz w:val="28"/>
-          <w:szCs w:val="28"/>
-        </w:rPr>
-        <w:t xml:space="preserve"> Disponibilidade 24 horas</w:t>
-      </w:r>
-    </w:p>
-    <w:p>
-      <w:pPr>
-        <w:pStyle w:val="PargrafodaLista"/>
-        <w:numPr>
-          <w:ilvl w:val="0"/>
           <w:numId w:val="5"/>
         </w:numPr>
         <w:jc w:val="both"/>
@@ -3254,6 +3583,7 @@
           <w:sz w:val="28"/>
           <w:szCs w:val="28"/>
         </w:rPr>
+        <w:lastRenderedPageBreak/>
         <w:t>Segurança e integridade das informações dos usuários.</w:t>
       </w:r>
     </w:p>
@@ -3615,24 +3945,29 @@
           <w:szCs w:val="28"/>
         </w:rPr>
       </w:pPr>
-    </w:p>
-    <w:p>
-      <w:pPr>
-        <w:pStyle w:val="PargrafodaLista"/>
-        <w:ind w:left="1440"/>
-        <w:jc w:val="both"/>
-        <w:rPr>
-          <w:sz w:val="28"/>
-          <w:szCs w:val="28"/>
-        </w:rPr>
-      </w:pPr>
+      <w:proofErr w:type="spellStart"/>
+      <w:r>
+        <w:rPr>
+          <w:sz w:val="28"/>
+          <w:szCs w:val="28"/>
+        </w:rPr>
+        <w:t>Grafico</w:t>
+      </w:r>
+      <w:proofErr w:type="spellEnd"/>
+      <w:r>
+        <w:rPr>
+          <w:sz w:val="28"/>
+          <w:szCs w:val="28"/>
+        </w:rPr>
+        <w:t xml:space="preserve"> de pizza e de colunas</w:t>
+      </w:r>
     </w:p>
     <w:p>
       <w:pPr>
         <w:pStyle w:val="PargrafodaLista"/>
         <w:numPr>
-          <w:ilvl w:val="0"/>
-          <w:numId w:val="5"/>
+          <w:ilvl w:val="1"/>
+          <w:numId w:val="10"/>
         </w:numPr>
         <w:jc w:val="both"/>
         <w:rPr>
@@ -3645,19 +3980,15 @@
           <w:sz w:val="28"/>
           <w:szCs w:val="28"/>
         </w:rPr>
-        <w:t>Tela de inserção de dados sobre a produção mensal;</w:t>
-      </w:r>
-    </w:p>
-    <w:p>
-      <w:pPr>
-        <w:pStyle w:val="PargrafodaLista"/>
-        <w:ind w:left="2124"/>
-        <w:jc w:val="both"/>
-        <w:rPr>
-          <w:sz w:val="28"/>
-          <w:szCs w:val="28"/>
-        </w:rPr>
-      </w:pPr>
+        <w:t>KPIs</w:t>
+      </w:r>
+      <w:r>
+        <w:rPr>
+          <w:sz w:val="28"/>
+          <w:szCs w:val="28"/>
+        </w:rPr>
+        <w:t xml:space="preserve"> da dashboard</w:t>
+      </w:r>
     </w:p>
     <w:p>
       <w:pPr>
@@ -3677,50 +4008,53 @@
           <w:sz w:val="28"/>
           <w:szCs w:val="28"/>
         </w:rPr>
-        <w:t>Diferentes acessos e nível de permissão.</w:t>
-      </w:r>
-    </w:p>
-    <w:p>
-      <w:pPr>
-        <w:pStyle w:val="PargrafodaLista"/>
-        <w:numPr>
-          <w:ilvl w:val="1"/>
-          <w:numId w:val="12"/>
-        </w:numPr>
+        <w:t>Sistema para cadastro de novos usuários.</w:t>
+      </w:r>
+    </w:p>
+    <w:p>
+      <w:pPr>
         <w:jc w:val="both"/>
         <w:rPr>
           <w:sz w:val="28"/>
           <w:szCs w:val="28"/>
         </w:rPr>
       </w:pPr>
-      <w:r>
-        <w:rPr>
-          <w:sz w:val="28"/>
-          <w:szCs w:val="28"/>
-        </w:rPr>
-        <w:t>Comum</w:t>
-      </w:r>
-    </w:p>
-    <w:p>
-      <w:pPr>
-        <w:pStyle w:val="PargrafodaLista"/>
-        <w:numPr>
-          <w:ilvl w:val="1"/>
-          <w:numId w:val="12"/>
-        </w:numPr>
+    </w:p>
+    <w:p/>
+    <w:p>
+      <w:pPr>
+        <w:pStyle w:val="PargrafodaLista"/>
+        <w:ind w:left="432"/>
+        <w:outlineLvl w:val="0"/>
+        <w:rPr>
+          <w:b/>
+          <w:sz w:val="32"/>
+          <w:szCs w:val="32"/>
+        </w:rPr>
+      </w:pPr>
+      <w:bookmarkStart w:id="2" w:name="_Toc211975055"/>
+      <w:r>
+        <w:rPr>
+          <w:b/>
+          <w:sz w:val="32"/>
+          <w:szCs w:val="32"/>
+        </w:rPr>
+        <w:t>7.</w:t>
+      </w:r>
+      <w:r>
+        <w:rPr>
+          <w:b/>
+          <w:sz w:val="32"/>
+          <w:szCs w:val="32"/>
+        </w:rPr>
+        <w:t>PREMISSAS</w:t>
+      </w:r>
+      <w:bookmarkEnd w:id="2"/>
+    </w:p>
+    <w:p>
+      <w:pPr>
         <w:jc w:val="both"/>
-        <w:rPr>
-          <w:sz w:val="28"/>
-          <w:szCs w:val="28"/>
-        </w:rPr>
-      </w:pPr>
-      <w:r>
-        <w:rPr>
-          <w:sz w:val="28"/>
-          <w:szCs w:val="28"/>
-        </w:rPr>
-        <w:t>Administrador</w:t>
-      </w:r>
+      </w:pPr>
     </w:p>
     <w:p>
       <w:pPr>
@@ -3740,53 +4074,50 @@
           <w:sz w:val="28"/>
           <w:szCs w:val="28"/>
         </w:rPr>
-        <w:t>Sistema para cadastro de novos usuários.</w:t>
-      </w:r>
-    </w:p>
-    <w:p>
-      <w:pPr>
-        <w:jc w:val="both"/>
-        <w:rPr>
-          <w:sz w:val="28"/>
-          <w:szCs w:val="28"/>
-        </w:rPr>
-      </w:pPr>
-    </w:p>
-    <w:p/>
-    <w:p>
-      <w:pPr>
-        <w:pStyle w:val="PargrafodaLista"/>
-        <w:ind w:left="432"/>
-        <w:outlineLvl w:val="0"/>
-        <w:rPr>
-          <w:b/>
-          <w:sz w:val="32"/>
-          <w:szCs w:val="32"/>
-        </w:rPr>
-      </w:pPr>
-      <w:bookmarkStart w:id="2" w:name="_Toc211975055"/>
-      <w:r>
-        <w:rPr>
-          <w:b/>
-          <w:sz w:val="32"/>
-          <w:szCs w:val="32"/>
-        </w:rPr>
-        <w:t>7.</w:t>
-      </w:r>
-      <w:r>
-        <w:rPr>
-          <w:b/>
-          <w:sz w:val="32"/>
-          <w:szCs w:val="32"/>
-        </w:rPr>
-        <w:t>PREMISSAS</w:t>
-      </w:r>
-      <w:bookmarkEnd w:id="2"/>
-    </w:p>
-    <w:p>
-      <w:pPr>
-        <w:jc w:val="both"/>
-      </w:pPr>
+        <w:t>O si</w:t>
+      </w:r>
+      <w:r>
+        <w:rPr>
+          <w:sz w:val="28"/>
+          <w:szCs w:val="28"/>
+        </w:rPr>
+        <w:t>te</w:t>
+      </w:r>
+      <w:r>
+        <w:rPr>
+          <w:sz w:val="28"/>
+          <w:szCs w:val="28"/>
+        </w:rPr>
+        <w:t xml:space="preserve"> depende de disponibilidade constante de rede </w:t>
+      </w:r>
+      <w:r>
+        <w:rPr>
+          <w:sz w:val="28"/>
+          <w:szCs w:val="28"/>
+        </w:rPr>
+        <w:t xml:space="preserve">de conexão </w:t>
+      </w:r>
+      <w:r>
+        <w:rPr>
+          <w:sz w:val="28"/>
+          <w:szCs w:val="28"/>
+        </w:rPr>
+        <w:t>à</w:t>
+      </w:r>
+      <w:r>
+        <w:rPr>
+          <w:sz w:val="28"/>
+          <w:szCs w:val="28"/>
+        </w:rPr>
+        <w:t xml:space="preserve"> internet</w:t>
+      </w:r>
+      <w:r>
+        <w:rPr>
+          <w:sz w:val="28"/>
+          <w:szCs w:val="28"/>
+        </w:rPr>
+        <w:t>. </w:t>
+      </w:r>
     </w:p>
     <w:p>
       <w:pPr>
@@ -3806,49 +4137,14 @@
           <w:sz w:val="28"/>
           <w:szCs w:val="28"/>
         </w:rPr>
-        <w:t>O si</w:t>
-      </w:r>
-      <w:r>
-        <w:rPr>
-          <w:sz w:val="28"/>
-          <w:szCs w:val="28"/>
-        </w:rPr>
-        <w:t>te</w:t>
-      </w:r>
-      <w:r>
-        <w:rPr>
-          <w:sz w:val="28"/>
-          <w:szCs w:val="28"/>
-        </w:rPr>
-        <w:t xml:space="preserve"> depende de disponibilidade constante de rede </w:t>
-      </w:r>
-      <w:r>
-        <w:rPr>
-          <w:sz w:val="28"/>
-          <w:szCs w:val="28"/>
-        </w:rPr>
-        <w:t xml:space="preserve">de conexão </w:t>
-      </w:r>
-      <w:r>
-        <w:rPr>
-          <w:sz w:val="28"/>
-          <w:szCs w:val="28"/>
-        </w:rPr>
-        <w:t>à</w:t>
-      </w:r>
-      <w:r>
-        <w:rPr>
-          <w:sz w:val="28"/>
-          <w:szCs w:val="28"/>
-        </w:rPr>
-        <w:t xml:space="preserve"> internet</w:t>
-      </w:r>
-      <w:r>
-        <w:rPr>
-          <w:sz w:val="28"/>
-          <w:szCs w:val="28"/>
-        </w:rPr>
-        <w:t>. </w:t>
+        <w:t xml:space="preserve">O site </w:t>
+      </w:r>
+      <w:r>
+        <w:rPr>
+          <w:sz w:val="28"/>
+          <w:szCs w:val="28"/>
+        </w:rPr>
+        <w:t>terá como tema principal o anime One Piece.</w:t>
       </w:r>
     </w:p>
     <w:p>
@@ -3869,15 +4165,21 @@
           <w:sz w:val="28"/>
           <w:szCs w:val="28"/>
         </w:rPr>
-        <w:lastRenderedPageBreak/>
-        <w:t xml:space="preserve">O site </w:t>
-      </w:r>
-      <w:r>
-        <w:rPr>
-          <w:sz w:val="28"/>
-          <w:szCs w:val="28"/>
-        </w:rPr>
-        <w:t>terá como tema principal o anime One Piece.</w:t>
+        <w:t>Os dados fornecidos pelo cliente a respeito d</w:t>
+      </w:r>
+      <w:r>
+        <w:rPr>
+          <w:sz w:val="28"/>
+          <w:szCs w:val="28"/>
+        </w:rPr>
+        <w:t>e seu cadastro e login</w:t>
+      </w:r>
+      <w:r>
+        <w:rPr>
+          <w:sz w:val="28"/>
+          <w:szCs w:val="28"/>
+        </w:rPr>
+        <w:t xml:space="preserve"> serão precisos e corretos.</w:t>
       </w:r>
     </w:p>
     <w:p>
@@ -3898,21 +4200,7 @@
           <w:sz w:val="28"/>
           <w:szCs w:val="28"/>
         </w:rPr>
-        <w:t>Os dados fornecidos pelo cliente a respeito d</w:t>
-      </w:r>
-      <w:r>
-        <w:rPr>
-          <w:sz w:val="28"/>
-          <w:szCs w:val="28"/>
-        </w:rPr>
-        <w:t>e seu cadastro e login</w:t>
-      </w:r>
-      <w:r>
-        <w:rPr>
-          <w:sz w:val="28"/>
-          <w:szCs w:val="28"/>
-        </w:rPr>
-        <w:t xml:space="preserve"> serão precisos e corretos.</w:t>
+        <w:t>Os dados de respostas do usuário serão armazenados no banco de dados para gerar uma dashboard.</w:t>
       </w:r>
     </w:p>
     <w:p>
@@ -3933,7 +4221,89 @@
           <w:sz w:val="28"/>
           <w:szCs w:val="28"/>
         </w:rPr>
-        <w:t>Os dados de respostas do usuário serão armazenados no banco de dados para gerar uma dashboard.</w:t>
+        <w:t xml:space="preserve">O site será executado na </w:t>
+      </w:r>
+      <w:r>
+        <w:rPr>
+          <w:sz w:val="28"/>
+          <w:szCs w:val="28"/>
+        </w:rPr>
+        <w:t>máquina</w:t>
+      </w:r>
+      <w:r>
+        <w:rPr>
+          <w:sz w:val="28"/>
+          <w:szCs w:val="28"/>
+        </w:rPr>
+        <w:t xml:space="preserve"> </w:t>
+      </w:r>
+      <w:r>
+        <w:rPr>
+          <w:sz w:val="28"/>
+          <w:szCs w:val="28"/>
+        </w:rPr>
+        <w:t xml:space="preserve">própria </w:t>
+      </w:r>
+      <w:r>
+        <w:rPr>
+          <w:sz w:val="28"/>
+          <w:szCs w:val="28"/>
+        </w:rPr>
+        <w:t>do usuário</w:t>
+      </w:r>
+      <w:r>
+        <w:rPr>
+          <w:sz w:val="28"/>
+          <w:szCs w:val="28"/>
+        </w:rPr>
+        <w:t>.</w:t>
+      </w:r>
+    </w:p>
+    <w:p>
+      <w:pPr>
+        <w:pStyle w:val="PargrafodaLista"/>
+        <w:ind w:left="432"/>
+        <w:outlineLvl w:val="0"/>
+        <w:rPr>
+          <w:b/>
+          <w:sz w:val="32"/>
+          <w:szCs w:val="32"/>
+        </w:rPr>
+      </w:pPr>
+      <w:bookmarkStart w:id="3" w:name="_Toc211975056"/>
+      <w:r>
+        <w:rPr>
+          <w:b/>
+          <w:sz w:val="32"/>
+          <w:szCs w:val="32"/>
+        </w:rPr>
+        <w:lastRenderedPageBreak/>
+        <w:t xml:space="preserve"> </w:t>
+      </w:r>
+      <w:r>
+        <w:rPr>
+          <w:b/>
+          <w:sz w:val="32"/>
+          <w:szCs w:val="32"/>
+        </w:rPr>
+        <w:t>8</w:t>
+      </w:r>
+      <w:r>
+        <w:rPr>
+          <w:b/>
+          <w:sz w:val="32"/>
+          <w:szCs w:val="32"/>
+        </w:rPr>
+        <w:t>.RESTRIÇÕES</w:t>
+      </w:r>
+      <w:bookmarkEnd w:id="3"/>
+    </w:p>
+    <w:p>
+      <w:pPr>
+        <w:jc w:val="both"/>
+      </w:pPr>
+      <w:r>
+        <w:t xml:space="preserve"> </w:t>
       </w:r>
     </w:p>
     <w:p>
@@ -3954,7 +4324,21 @@
           <w:sz w:val="28"/>
           <w:szCs w:val="28"/>
         </w:rPr>
-        <w:t>Necessária alimentação elétrica contínua para o sistema.</w:t>
+        <w:t xml:space="preserve">O projeto deve ser concluído até 24 de </w:t>
+      </w:r>
+      <w:r>
+        <w:rPr>
+          <w:sz w:val="28"/>
+          <w:szCs w:val="28"/>
+        </w:rPr>
+        <w:t>novembro</w:t>
+      </w:r>
+      <w:r>
+        <w:rPr>
+          <w:sz w:val="28"/>
+          <w:szCs w:val="28"/>
+        </w:rPr>
+        <w:t xml:space="preserve"> de 2025.  </w:t>
       </w:r>
     </w:p>
     <w:p>
@@ -3975,7 +4359,7 @@
           <w:sz w:val="28"/>
           <w:szCs w:val="28"/>
         </w:rPr>
-        <w:t xml:space="preserve">Alimentação Bivolt. </w:t>
+        <w:t>Será tema do site um único anime, sendo este One Piece.</w:t>
       </w:r>
     </w:p>
     <w:p>
@@ -3996,110 +4380,7 @@
           <w:sz w:val="28"/>
           <w:szCs w:val="28"/>
         </w:rPr>
-        <w:t xml:space="preserve">O site será executado na </w:t>
-      </w:r>
-      <w:r>
-        <w:rPr>
-          <w:sz w:val="28"/>
-          <w:szCs w:val="28"/>
-        </w:rPr>
-        <w:t>máquina</w:t>
-      </w:r>
-      <w:r>
-        <w:rPr>
-          <w:sz w:val="28"/>
-          <w:szCs w:val="28"/>
-        </w:rPr>
-        <w:t xml:space="preserve"> </w:t>
-      </w:r>
-      <w:r>
-        <w:rPr>
-          <w:sz w:val="28"/>
-          <w:szCs w:val="28"/>
-        </w:rPr>
-        <w:t xml:space="preserve">própria </w:t>
-      </w:r>
-      <w:r>
-        <w:rPr>
-          <w:sz w:val="28"/>
-          <w:szCs w:val="28"/>
-        </w:rPr>
-        <w:t>do usuário</w:t>
-      </w:r>
-      <w:r>
-        <w:rPr>
-          <w:sz w:val="28"/>
-          <w:szCs w:val="28"/>
-        </w:rPr>
-        <w:t>.</w:t>
-      </w:r>
-    </w:p>
-    <w:p>
-      <w:pPr>
-        <w:rPr>
-          <w:sz w:val="28"/>
-          <w:szCs w:val="28"/>
-        </w:rPr>
-      </w:pPr>
-    </w:p>
-    <w:p>
-      <w:pPr>
-        <w:jc w:val="both"/>
-        <w:rPr>
-          <w:sz w:val="28"/>
-          <w:szCs w:val="28"/>
-        </w:rPr>
-      </w:pPr>
-    </w:p>
-    <w:p>
-      <w:pPr>
-        <w:jc w:val="both"/>
-      </w:pPr>
-    </w:p>
-    <w:p>
-      <w:pPr>
-        <w:pStyle w:val="PargrafodaLista"/>
-        <w:ind w:left="432"/>
-        <w:outlineLvl w:val="0"/>
-        <w:rPr>
-          <w:b/>
-          <w:sz w:val="32"/>
-          <w:szCs w:val="32"/>
-        </w:rPr>
-      </w:pPr>
-      <w:bookmarkStart w:id="3" w:name="_Toc211975056"/>
-      <w:r>
-        <w:rPr>
-          <w:b/>
-          <w:sz w:val="32"/>
-          <w:szCs w:val="32"/>
-        </w:rPr>
-        <w:t xml:space="preserve"> </w:t>
-      </w:r>
-      <w:r>
-        <w:rPr>
-          <w:b/>
-          <w:sz w:val="32"/>
-          <w:szCs w:val="32"/>
-        </w:rPr>
-        <w:t>8</w:t>
-      </w:r>
-      <w:r>
-        <w:rPr>
-          <w:b/>
-          <w:sz w:val="32"/>
-          <w:szCs w:val="32"/>
-        </w:rPr>
-        <w:t>.RESTRIÇÕES</w:t>
-      </w:r>
-      <w:bookmarkEnd w:id="3"/>
-    </w:p>
-    <w:p>
-      <w:pPr>
-        <w:jc w:val="both"/>
-      </w:pPr>
-      <w:r>
-        <w:t xml:space="preserve"> </w:t>
+        <w:t>Tema do projeto precisa ter uma relação clara com a vida de desenvolvedor.</w:t>
       </w:r>
     </w:p>
     <w:p>
@@ -4120,78 +4401,8 @@
           <w:sz w:val="28"/>
           <w:szCs w:val="28"/>
         </w:rPr>
-        <w:t xml:space="preserve">O projeto deve ser concluído até 24 de </w:t>
-      </w:r>
-      <w:r>
-        <w:rPr>
-          <w:sz w:val="28"/>
-          <w:szCs w:val="28"/>
-        </w:rPr>
-        <w:t>novembro</w:t>
-      </w:r>
-      <w:r>
-        <w:rPr>
-          <w:sz w:val="28"/>
-          <w:szCs w:val="28"/>
-        </w:rPr>
-        <w:t xml:space="preserve"> de 2025.  </w:t>
-      </w:r>
-    </w:p>
-    <w:p>
-      <w:pPr>
-        <w:pStyle w:val="PargrafodaLista"/>
-        <w:numPr>
-          <w:ilvl w:val="0"/>
-          <w:numId w:val="6"/>
-        </w:numPr>
-        <w:jc w:val="both"/>
-        <w:rPr>
-          <w:sz w:val="28"/>
-          <w:szCs w:val="28"/>
-        </w:rPr>
-      </w:pPr>
-      <w:r>
-        <w:rPr>
-          <w:sz w:val="28"/>
-          <w:szCs w:val="28"/>
-        </w:rPr>
-        <w:t>Será tema do site um único anime, sendo este One Piece.</w:t>
-      </w:r>
-    </w:p>
-    <w:p>
-      <w:pPr>
-        <w:pStyle w:val="PargrafodaLista"/>
-        <w:numPr>
-          <w:ilvl w:val="0"/>
-          <w:numId w:val="6"/>
-        </w:numPr>
-        <w:jc w:val="both"/>
-        <w:rPr>
-          <w:sz w:val="28"/>
-          <w:szCs w:val="28"/>
-        </w:rPr>
-      </w:pPr>
-      <w:r>
-        <w:rPr>
-          <w:sz w:val="28"/>
-          <w:szCs w:val="28"/>
-        </w:rPr>
-        <w:t>Tema do projeto precisa ter uma relação clara com a vida de desenvolvedor.</w:t>
-      </w:r>
-    </w:p>
-    <w:p>
-      <w:pPr>
-        <w:pStyle w:val="PargrafodaLista"/>
-        <w:numPr>
-          <w:ilvl w:val="0"/>
-          <w:numId w:val="6"/>
-        </w:numPr>
-        <w:jc w:val="both"/>
-        <w:rPr>
-          <w:sz w:val="28"/>
-          <w:szCs w:val="28"/>
-        </w:rPr>
-      </w:pPr>
+        <w:t>O projeto só pode ser feito com conhecimento prévio do anime.</w:t>
+      </w:r>
     </w:p>
     <w:p>
       <w:pPr>
@@ -4368,10 +4579,6 @@
     <w:p>
       <w:pPr>
         <w:pStyle w:val="PargrafodaLista"/>
-        <w:numPr>
-          <w:ilvl w:val="0"/>
-          <w:numId w:val="2"/>
-        </w:numPr>
         <w:rPr>
           <w:sz w:val="28"/>
           <w:szCs w:val="28"/>

</xml_diff>

<commit_message>
Codigos da API que estavam encaminhando para o diretorio original da API e não estavam commitando minhas mudanças
</commit_message>
<xml_diff>
--- a/TI/Documentação Projeto Pessoal.docx
+++ b/TI/Documentação Projeto Pessoal.docx
@@ -15,7 +15,23 @@
           <w:sz w:val="36"/>
           <w:szCs w:val="36"/>
         </w:rPr>
-        <w:t>Documentação Projeto Pessoal – One Piece</w:t>
+        <w:t xml:space="preserve">Documentação Projeto Pessoal – </w:t>
+      </w:r>
+      <w:proofErr w:type="spellStart"/>
+      <w:r>
+        <w:rPr>
+          <w:sz w:val="36"/>
+          <w:szCs w:val="36"/>
+        </w:rPr>
+        <w:t>One</w:t>
+      </w:r>
+      <w:proofErr w:type="spellEnd"/>
+      <w:r>
+        <w:rPr>
+          <w:sz w:val="36"/>
+          <w:szCs w:val="36"/>
+        </w:rPr>
+        <w:t xml:space="preserve"> Piece</w:t>
       </w:r>
     </w:p>
     <w:p>
@@ -71,12 +87,21 @@
           <w:szCs w:val="28"/>
         </w:rPr>
       </w:pPr>
-      <w:r>
-        <w:rPr>
-          <w:sz w:val="28"/>
-          <w:szCs w:val="28"/>
-        </w:rPr>
-        <w:t xml:space="preserve">One Piece é </w:t>
+      <w:proofErr w:type="spellStart"/>
+      <w:r>
+        <w:rPr>
+          <w:sz w:val="28"/>
+          <w:szCs w:val="28"/>
+        </w:rPr>
+        <w:t>One</w:t>
+      </w:r>
+      <w:proofErr w:type="spellEnd"/>
+      <w:r>
+        <w:rPr>
+          <w:sz w:val="28"/>
+          <w:szCs w:val="28"/>
+        </w:rPr>
+        <w:t xml:space="preserve"> Piece é </w:t>
       </w:r>
       <w:r>
         <w:rPr>
@@ -90,7 +115,39 @@
           <w:sz w:val="28"/>
           <w:szCs w:val="28"/>
         </w:rPr>
-        <w:t xml:space="preserve"> japonês do mangaka (autor) Eichiiro </w:t>
+        <w:t xml:space="preserve"> japonês do </w:t>
+      </w:r>
+      <w:proofErr w:type="spellStart"/>
+      <w:r>
+        <w:rPr>
+          <w:sz w:val="28"/>
+          <w:szCs w:val="28"/>
+        </w:rPr>
+        <w:t>mangaka</w:t>
+      </w:r>
+      <w:proofErr w:type="spellEnd"/>
+      <w:r>
+        <w:rPr>
+          <w:sz w:val="28"/>
+          <w:szCs w:val="28"/>
+        </w:rPr>
+        <w:t xml:space="preserve"> (autor) </w:t>
+      </w:r>
+      <w:proofErr w:type="spellStart"/>
+      <w:r>
+        <w:rPr>
+          <w:sz w:val="28"/>
+          <w:szCs w:val="28"/>
+        </w:rPr>
+        <w:t>Eichiiro</w:t>
+      </w:r>
+      <w:proofErr w:type="spellEnd"/>
+      <w:r>
+        <w:rPr>
+          <w:sz w:val="28"/>
+          <w:szCs w:val="28"/>
+        </w:rPr>
+        <w:t xml:space="preserve"> </w:t>
       </w:r>
       <w:r>
         <w:rPr>
@@ -111,7 +168,23 @@
           <w:sz w:val="28"/>
           <w:szCs w:val="28"/>
         </w:rPr>
-        <w:t xml:space="preserve"> sendo publicado na revista Weekly Shonen Jump. </w:t>
+        <w:t xml:space="preserve"> sendo publicado na revista Weekly </w:t>
+      </w:r>
+      <w:proofErr w:type="spellStart"/>
+      <w:r>
+        <w:rPr>
+          <w:sz w:val="28"/>
+          <w:szCs w:val="28"/>
+        </w:rPr>
+        <w:t>Shonen</w:t>
+      </w:r>
+      <w:proofErr w:type="spellEnd"/>
+      <w:r>
+        <w:rPr>
+          <w:sz w:val="28"/>
+          <w:szCs w:val="28"/>
+        </w:rPr>
+        <w:t xml:space="preserve"> Jump. </w:t>
       </w:r>
       <w:r>
         <w:rPr>
@@ -153,7 +226,23 @@
           <w:sz w:val="28"/>
           <w:szCs w:val="28"/>
         </w:rPr>
-        <w:t>e em 20 de outubro de 1999 a obra One Piec</w:t>
+        <w:t xml:space="preserve">e em 20 de outubro de 1999 a obra </w:t>
+      </w:r>
+      <w:proofErr w:type="spellStart"/>
+      <w:r>
+        <w:rPr>
+          <w:sz w:val="28"/>
+          <w:szCs w:val="28"/>
+        </w:rPr>
+        <w:t>One</w:t>
+      </w:r>
+      <w:proofErr w:type="spellEnd"/>
+      <w:r>
+        <w:rPr>
+          <w:sz w:val="28"/>
+          <w:szCs w:val="28"/>
+        </w:rPr>
+        <w:t xml:space="preserve"> Piec</w:t>
       </w:r>
       <w:r>
         <w:rPr>
@@ -174,7 +263,23 @@
           <w:sz w:val="28"/>
           <w:szCs w:val="28"/>
         </w:rPr>
-        <w:t>em forma de anime. A obra de ficção de Eichiiro Oda se tornou um fenômeno mundial</w:t>
+        <w:t xml:space="preserve">em forma de anime. A obra de ficção de </w:t>
+      </w:r>
+      <w:proofErr w:type="spellStart"/>
+      <w:r>
+        <w:rPr>
+          <w:sz w:val="28"/>
+          <w:szCs w:val="28"/>
+        </w:rPr>
+        <w:t>Eichiiro</w:t>
+      </w:r>
+      <w:proofErr w:type="spellEnd"/>
+      <w:r>
+        <w:rPr>
+          <w:sz w:val="28"/>
+          <w:szCs w:val="28"/>
+        </w:rPr>
+        <w:t xml:space="preserve"> Oda se tornou um fenômeno mundial</w:t>
       </w:r>
       <w:r>
         <w:rPr>
@@ -230,7 +335,23 @@
           <w:sz w:val="28"/>
           <w:szCs w:val="28"/>
         </w:rPr>
-        <w:t xml:space="preserve"> Batman. A obra de Eiichiro Oda continua a crescer, aproximando-se do recorde de quadrinhos mais vendidos do mundo. </w:t>
+        <w:t xml:space="preserve"> Batman. A obra de </w:t>
+      </w:r>
+      <w:proofErr w:type="spellStart"/>
+      <w:r>
+        <w:rPr>
+          <w:sz w:val="28"/>
+          <w:szCs w:val="28"/>
+        </w:rPr>
+        <w:t>Eiichiro</w:t>
+      </w:r>
+      <w:proofErr w:type="spellEnd"/>
+      <w:r>
+        <w:rPr>
+          <w:sz w:val="28"/>
+          <w:szCs w:val="28"/>
+        </w:rPr>
+        <w:t xml:space="preserve"> Oda continua a crescer, aproximando-se do recorde de quadrinhos mais vendidos do mundo. </w:t>
       </w:r>
       <w:r>
         <w:rPr>
@@ -380,7 +501,39 @@
           <w:sz w:val="28"/>
           <w:szCs w:val="28"/>
         </w:rPr>
-        <w:t>gira em torno de Monkey D. Luffy e sua tripulação</w:t>
+        <w:t xml:space="preserve">gira em torno de </w:t>
+      </w:r>
+      <w:proofErr w:type="spellStart"/>
+      <w:r>
+        <w:rPr>
+          <w:sz w:val="28"/>
+          <w:szCs w:val="28"/>
+        </w:rPr>
+        <w:t>Monkey</w:t>
+      </w:r>
+      <w:proofErr w:type="spellEnd"/>
+      <w:r>
+        <w:rPr>
+          <w:sz w:val="28"/>
+          <w:szCs w:val="28"/>
+        </w:rPr>
+        <w:t xml:space="preserve"> D. </w:t>
+      </w:r>
+      <w:proofErr w:type="spellStart"/>
+      <w:r>
+        <w:rPr>
+          <w:sz w:val="28"/>
+          <w:szCs w:val="28"/>
+        </w:rPr>
+        <w:t>Luffy</w:t>
+      </w:r>
+      <w:proofErr w:type="spellEnd"/>
+      <w:r>
+        <w:rPr>
+          <w:sz w:val="28"/>
+          <w:szCs w:val="28"/>
+        </w:rPr>
+        <w:t xml:space="preserve"> e sua tripulação</w:t>
       </w:r>
       <w:r>
         <w:rPr>
@@ -600,7 +753,23 @@
           <w:sz w:val="28"/>
           <w:szCs w:val="28"/>
         </w:rPr>
-        <w:t xml:space="preserve"> através de backstories (</w:t>
+        <w:t xml:space="preserve"> através de </w:t>
+      </w:r>
+      <w:proofErr w:type="spellStart"/>
+      <w:r>
+        <w:rPr>
+          <w:sz w:val="28"/>
+          <w:szCs w:val="28"/>
+        </w:rPr>
+        <w:t>backstories</w:t>
+      </w:r>
+      <w:proofErr w:type="spellEnd"/>
+      <w:r>
+        <w:rPr>
+          <w:sz w:val="28"/>
+          <w:szCs w:val="28"/>
+        </w:rPr>
+        <w:t xml:space="preserve"> (</w:t>
       </w:r>
       <w:r>
         <w:rPr>
@@ -702,7 +871,23 @@
           <w:sz w:val="28"/>
           <w:szCs w:val="28"/>
         </w:rPr>
-        <w:t xml:space="preserve"> Eichiro Oda faz uma correlação com o racismo sofrido pelas pessoas negras em detrimento dos anos de escravidão</w:t>
+        <w:t xml:space="preserve"> </w:t>
+      </w:r>
+      <w:proofErr w:type="spellStart"/>
+      <w:r>
+        <w:rPr>
+          <w:sz w:val="28"/>
+          <w:szCs w:val="28"/>
+        </w:rPr>
+        <w:t>Eichiro</w:t>
+      </w:r>
+      <w:proofErr w:type="spellEnd"/>
+      <w:r>
+        <w:rPr>
+          <w:sz w:val="28"/>
+          <w:szCs w:val="28"/>
+        </w:rPr>
+        <w:t xml:space="preserve"> Oda faz uma correlação com o racismo sofrido pelas pessoas negras em detrimento dos anos de escravidão</w:t>
       </w:r>
       <w:r>
         <w:rPr>
@@ -723,7 +908,23 @@
           <w:sz w:val="28"/>
           <w:szCs w:val="28"/>
         </w:rPr>
-        <w:t xml:space="preserve"> há duas figuras importantes: Fisher Tiger e Queen Otohime, que representam </w:t>
+        <w:t xml:space="preserve"> há duas figuras importantes: Fisher Tiger e Queen </w:t>
+      </w:r>
+      <w:proofErr w:type="spellStart"/>
+      <w:r>
+        <w:rPr>
+          <w:sz w:val="28"/>
+          <w:szCs w:val="28"/>
+        </w:rPr>
+        <w:t>Otohime</w:t>
+      </w:r>
+      <w:proofErr w:type="spellEnd"/>
+      <w:r>
+        <w:rPr>
+          <w:sz w:val="28"/>
+          <w:szCs w:val="28"/>
+        </w:rPr>
+        <w:t xml:space="preserve">, que representam </w:t>
       </w:r>
       <w:r>
         <w:rPr>
@@ -827,14 +1028,46 @@
           <w:sz w:val="28"/>
           <w:szCs w:val="28"/>
         </w:rPr>
-        <w:t>Tendo uma habilidade de trazer o leitor para dentro da obra, é normal notar que a popularidade de One Piece é cada vez maior, saindo em divers</w:t>
-      </w:r>
-      <w:r>
-        <w:rPr>
-          <w:sz w:val="28"/>
-          <w:szCs w:val="28"/>
-        </w:rPr>
-        <w:t>os segmentos midiáticos como por exemplo o Live Action produzido pela Netflix</w:t>
+        <w:t xml:space="preserve">Tendo uma habilidade de trazer o leitor para dentro da obra, é normal notar que a popularidade de </w:t>
+      </w:r>
+      <w:proofErr w:type="spellStart"/>
+      <w:r>
+        <w:rPr>
+          <w:sz w:val="28"/>
+          <w:szCs w:val="28"/>
+        </w:rPr>
+        <w:t>One</w:t>
+      </w:r>
+      <w:proofErr w:type="spellEnd"/>
+      <w:r>
+        <w:rPr>
+          <w:sz w:val="28"/>
+          <w:szCs w:val="28"/>
+        </w:rPr>
+        <w:t xml:space="preserve"> Piece é cada vez maior, saindo em divers</w:t>
+      </w:r>
+      <w:r>
+        <w:rPr>
+          <w:sz w:val="28"/>
+          <w:szCs w:val="28"/>
+        </w:rPr>
+        <w:t xml:space="preserve">os segmentos midiáticos como por exemplo o Live </w:t>
+      </w:r>
+      <w:proofErr w:type="spellStart"/>
+      <w:r>
+        <w:rPr>
+          <w:sz w:val="28"/>
+          <w:szCs w:val="28"/>
+        </w:rPr>
+        <w:t>Action</w:t>
+      </w:r>
+      <w:proofErr w:type="spellEnd"/>
+      <w:r>
+        <w:rPr>
+          <w:sz w:val="28"/>
+          <w:szCs w:val="28"/>
+        </w:rPr>
+        <w:t xml:space="preserve"> produzido pela Netflix</w:t>
       </w:r>
       <w:r>
         <w:rPr>
@@ -855,7 +1088,23 @@
           <w:sz w:val="28"/>
           <w:szCs w:val="28"/>
         </w:rPr>
-        <w:t xml:space="preserve"> primeira temporada da série live-action de One Piece ficou em primeiro lugar como a mais assistida em 93 países</w:t>
+        <w:t xml:space="preserve"> primeira temporada da série live-action de </w:t>
+      </w:r>
+      <w:proofErr w:type="spellStart"/>
+      <w:r>
+        <w:rPr>
+          <w:sz w:val="28"/>
+          <w:szCs w:val="28"/>
+        </w:rPr>
+        <w:t>One</w:t>
+      </w:r>
+      <w:proofErr w:type="spellEnd"/>
+      <w:r>
+        <w:rPr>
+          <w:sz w:val="28"/>
+          <w:szCs w:val="28"/>
+        </w:rPr>
+        <w:t xml:space="preserve"> Piece ficou em primeiro lugar como a mais assistida em 93 países</w:t>
       </w:r>
       <w:r>
         <w:rPr>
@@ -876,8 +1125,17 @@
           <w:sz w:val="28"/>
           <w:szCs w:val="28"/>
         </w:rPr>
-        <w:t xml:space="preserve"> em collabs</w:t>
-      </w:r>
+        <w:t xml:space="preserve"> em </w:t>
+      </w:r>
+      <w:proofErr w:type="spellStart"/>
+      <w:r>
+        <w:rPr>
+          <w:sz w:val="28"/>
+          <w:szCs w:val="28"/>
+        </w:rPr>
+        <w:t>collabs</w:t>
+      </w:r>
+      <w:proofErr w:type="spellEnd"/>
       <w:r>
         <w:rPr>
           <w:sz w:val="28"/>
@@ -1059,12 +1317,37 @@
         </w:rPr>
         <w:t xml:space="preserve">Figura 1– </w:t>
       </w:r>
-      <w:r>
-        <w:rPr>
-          <w:sz w:val="28"/>
-          <w:szCs w:val="28"/>
-        </w:rPr>
-        <w:t>One Piece Live Action produzido pela Netflix</w:t>
+      <w:proofErr w:type="spellStart"/>
+      <w:r>
+        <w:rPr>
+          <w:sz w:val="28"/>
+          <w:szCs w:val="28"/>
+        </w:rPr>
+        <w:t>One</w:t>
+      </w:r>
+      <w:proofErr w:type="spellEnd"/>
+      <w:r>
+        <w:rPr>
+          <w:sz w:val="28"/>
+          <w:szCs w:val="28"/>
+        </w:rPr>
+        <w:t xml:space="preserve"> Piece Live </w:t>
+      </w:r>
+      <w:proofErr w:type="spellStart"/>
+      <w:r>
+        <w:rPr>
+          <w:sz w:val="28"/>
+          <w:szCs w:val="28"/>
+        </w:rPr>
+        <w:t>Action</w:t>
+      </w:r>
+      <w:proofErr w:type="spellEnd"/>
+      <w:r>
+        <w:rPr>
+          <w:sz w:val="28"/>
+          <w:szCs w:val="28"/>
+        </w:rPr>
+        <w:t xml:space="preserve"> produzido pela Netflix</w:t>
       </w:r>
     </w:p>
     <w:p>
@@ -1163,12 +1446,37 @@
         </w:rPr>
         <w:t xml:space="preserve">Figura 2- </w:t>
       </w:r>
-      <w:r>
-        <w:rPr>
-          <w:sz w:val="28"/>
-          <w:szCs w:val="28"/>
-        </w:rPr>
-        <w:t>One Piece collab com Lakers</w:t>
+      <w:proofErr w:type="spellStart"/>
+      <w:r>
+        <w:rPr>
+          <w:sz w:val="28"/>
+          <w:szCs w:val="28"/>
+        </w:rPr>
+        <w:t>One</w:t>
+      </w:r>
+      <w:proofErr w:type="spellEnd"/>
+      <w:r>
+        <w:rPr>
+          <w:sz w:val="28"/>
+          <w:szCs w:val="28"/>
+        </w:rPr>
+        <w:t xml:space="preserve"> Piece </w:t>
+      </w:r>
+      <w:proofErr w:type="spellStart"/>
+      <w:r>
+        <w:rPr>
+          <w:sz w:val="28"/>
+          <w:szCs w:val="28"/>
+        </w:rPr>
+        <w:t>collab</w:t>
+      </w:r>
+      <w:proofErr w:type="spellEnd"/>
+      <w:r>
+        <w:rPr>
+          <w:sz w:val="28"/>
+          <w:szCs w:val="28"/>
+        </w:rPr>
+        <w:t xml:space="preserve"> com Lakers</w:t>
       </w:r>
     </w:p>
     <w:p>
@@ -1256,7 +1564,23 @@
           <w:sz w:val="28"/>
           <w:szCs w:val="28"/>
         </w:rPr>
-        <w:t>Figura 3- Bandeira do One Piece sendo usada em protesto</w:t>
+        <w:t xml:space="preserve">Figura 3- Bandeira do </w:t>
+      </w:r>
+      <w:proofErr w:type="spellStart"/>
+      <w:r>
+        <w:rPr>
+          <w:sz w:val="28"/>
+          <w:szCs w:val="28"/>
+        </w:rPr>
+        <w:t>One</w:t>
+      </w:r>
+      <w:proofErr w:type="spellEnd"/>
+      <w:r>
+        <w:rPr>
+          <w:sz w:val="28"/>
+          <w:szCs w:val="28"/>
+        </w:rPr>
+        <w:t xml:space="preserve"> Piece sendo usada em protesto</w:t>
       </w:r>
     </w:p>
     <w:p>
@@ -1447,7 +1771,23 @@
           <w:sz w:val="28"/>
           <w:szCs w:val="28"/>
         </w:rPr>
-        <w:t xml:space="preserve">dos personagens, sendo a primeira que mais me marcou foi a do Chopper, resumidamente, é a </w:t>
+        <w:t xml:space="preserve">dos personagens, sendo a primeira que mais me marcou foi a do </w:t>
+      </w:r>
+      <w:proofErr w:type="spellStart"/>
+      <w:r>
+        <w:rPr>
+          <w:sz w:val="28"/>
+          <w:szCs w:val="28"/>
+        </w:rPr>
+        <w:t>Chopper</w:t>
+      </w:r>
+      <w:proofErr w:type="spellEnd"/>
+      <w:r>
+        <w:rPr>
+          <w:sz w:val="28"/>
+          <w:szCs w:val="28"/>
+        </w:rPr>
+        <w:t xml:space="preserve">, resumidamente, é a </w:t>
       </w:r>
       <w:r>
         <w:rPr>
@@ -1496,7 +1836,39 @@
           <w:sz w:val="28"/>
           <w:szCs w:val="28"/>
         </w:rPr>
-        <w:t xml:space="preserve"> Hito Hito no Mi</w:t>
+        <w:t xml:space="preserve"> </w:t>
+      </w:r>
+      <w:proofErr w:type="spellStart"/>
+      <w:r>
+        <w:rPr>
+          <w:sz w:val="28"/>
+          <w:szCs w:val="28"/>
+        </w:rPr>
+        <w:t>Hito</w:t>
+      </w:r>
+      <w:proofErr w:type="spellEnd"/>
+      <w:r>
+        <w:rPr>
+          <w:sz w:val="28"/>
+          <w:szCs w:val="28"/>
+        </w:rPr>
+        <w:t xml:space="preserve"> </w:t>
+      </w:r>
+      <w:proofErr w:type="spellStart"/>
+      <w:r>
+        <w:rPr>
+          <w:sz w:val="28"/>
+          <w:szCs w:val="28"/>
+        </w:rPr>
+        <w:t>Hito</w:t>
+      </w:r>
+      <w:proofErr w:type="spellEnd"/>
+      <w:r>
+        <w:rPr>
+          <w:sz w:val="28"/>
+          <w:szCs w:val="28"/>
+        </w:rPr>
+        <w:t xml:space="preserve"> no Mi</w:t>
       </w:r>
       <w:r>
         <w:rPr>
@@ -1524,7 +1896,23 @@
           <w:sz w:val="28"/>
           <w:szCs w:val="28"/>
         </w:rPr>
-        <w:t xml:space="preserve">, este foi expulso da matilha. Após uma tentativa falha de Chopper de se comunicar com os humanos por conta do medo destes, o personagem passa um tempo </w:t>
+        <w:t xml:space="preserve">, este foi expulso da matilha. Após uma tentativa falha de </w:t>
+      </w:r>
+      <w:proofErr w:type="spellStart"/>
+      <w:r>
+        <w:rPr>
+          <w:sz w:val="28"/>
+          <w:szCs w:val="28"/>
+        </w:rPr>
+        <w:t>Chopper</w:t>
+      </w:r>
+      <w:proofErr w:type="spellEnd"/>
+      <w:r>
+        <w:rPr>
+          <w:sz w:val="28"/>
+          <w:szCs w:val="28"/>
+        </w:rPr>
+        <w:t xml:space="preserve"> de se comunicar com os humanos por conta do medo destes, o personagem passa um tempo </w:t>
       </w:r>
       <w:r>
         <w:rPr>
@@ -1560,7 +1948,23 @@
           <w:sz w:val="28"/>
           <w:szCs w:val="28"/>
         </w:rPr>
-        <w:t xml:space="preserve"> ótica que os outros tem deles, onde o Chopper é tratado como um monstro e o pai como um médico fajuto.</w:t>
+        <w:t xml:space="preserve"> ótica que os outros tem deles, onde o </w:t>
+      </w:r>
+      <w:proofErr w:type="spellStart"/>
+      <w:r>
+        <w:rPr>
+          <w:sz w:val="28"/>
+          <w:szCs w:val="28"/>
+        </w:rPr>
+        <w:t>Chopper</w:t>
+      </w:r>
+      <w:proofErr w:type="spellEnd"/>
+      <w:r>
+        <w:rPr>
+          <w:sz w:val="28"/>
+          <w:szCs w:val="28"/>
+        </w:rPr>
+        <w:t xml:space="preserve"> é tratado como um monstro e o pai como um médico fajuto.</w:t>
       </w:r>
     </w:p>
     <w:p>
@@ -1576,14 +1980,39 @@
           <w:sz w:val="28"/>
           <w:szCs w:val="28"/>
         </w:rPr>
-        <w:t>No desenrolar da backstorie</w:t>
-      </w:r>
-      <w:r>
-        <w:rPr>
-          <w:sz w:val="28"/>
-          <w:szCs w:val="28"/>
-        </w:rPr>
-        <w:t xml:space="preserve"> Chopper acaba perdendo seu pai </w:t>
+        <w:t xml:space="preserve">No desenrolar da </w:t>
+      </w:r>
+      <w:proofErr w:type="spellStart"/>
+      <w:r>
+        <w:rPr>
+          <w:sz w:val="28"/>
+          <w:szCs w:val="28"/>
+        </w:rPr>
+        <w:t>backstorie</w:t>
+      </w:r>
+      <w:proofErr w:type="spellEnd"/>
+      <w:r>
+        <w:rPr>
+          <w:sz w:val="28"/>
+          <w:szCs w:val="28"/>
+        </w:rPr>
+        <w:t xml:space="preserve"> </w:t>
+      </w:r>
+      <w:proofErr w:type="spellStart"/>
+      <w:r>
+        <w:rPr>
+          <w:sz w:val="28"/>
+          <w:szCs w:val="28"/>
+        </w:rPr>
+        <w:t>Chopper</w:t>
+      </w:r>
+      <w:proofErr w:type="spellEnd"/>
+      <w:r>
+        <w:rPr>
+          <w:sz w:val="28"/>
+          <w:szCs w:val="28"/>
+        </w:rPr>
+        <w:t xml:space="preserve"> acaba perdendo seu pai </w:t>
       </w:r>
       <w:r>
         <w:rPr>
@@ -1704,7 +2133,23 @@
           <w:sz w:val="28"/>
           <w:szCs w:val="28"/>
         </w:rPr>
-        <w:t xml:space="preserve"> por exemplo as palavras do pai de Chopper sempre me fazem lembrar meu primo que perdi aos 13 anos</w:t>
+        <w:t xml:space="preserve"> por exemplo as palavras do pai de </w:t>
+      </w:r>
+      <w:proofErr w:type="spellStart"/>
+      <w:r>
+        <w:rPr>
+          <w:sz w:val="28"/>
+          <w:szCs w:val="28"/>
+        </w:rPr>
+        <w:t>Chopper</w:t>
+      </w:r>
+      <w:proofErr w:type="spellEnd"/>
+      <w:r>
+        <w:rPr>
+          <w:sz w:val="28"/>
+          <w:szCs w:val="28"/>
+        </w:rPr>
+        <w:t xml:space="preserve"> sempre me fazem lembrar meu primo que perdi aos 13 anos</w:t>
       </w:r>
       <w:r>
         <w:rPr>
@@ -1838,7 +2283,23 @@
           <w:szCs w:val="28"/>
         </w:rPr>
         <w:tab/>
-        <w:t>Tendo em vista o quanto a obra One Piece impactou</w:t>
+        <w:t xml:space="preserve">Tendo em vista o quanto a obra </w:t>
+      </w:r>
+      <w:proofErr w:type="spellStart"/>
+      <w:r>
+        <w:rPr>
+          <w:sz w:val="28"/>
+          <w:szCs w:val="28"/>
+        </w:rPr>
+        <w:t>One</w:t>
+      </w:r>
+      <w:proofErr w:type="spellEnd"/>
+      <w:r>
+        <w:rPr>
+          <w:sz w:val="28"/>
+          <w:szCs w:val="28"/>
+        </w:rPr>
+        <w:t xml:space="preserve"> Piece impactou</w:t>
       </w:r>
       <w:r>
         <w:rPr>
@@ -2065,7 +2526,23 @@
           <w:sz w:val="28"/>
           <w:szCs w:val="28"/>
         </w:rPr>
-        <w:t xml:space="preserve"> ao universo de One Piece</w:t>
+        <w:t xml:space="preserve"> ao universo de </w:t>
+      </w:r>
+      <w:proofErr w:type="spellStart"/>
+      <w:r>
+        <w:rPr>
+          <w:sz w:val="28"/>
+          <w:szCs w:val="28"/>
+        </w:rPr>
+        <w:t>One</w:t>
+      </w:r>
+      <w:proofErr w:type="spellEnd"/>
+      <w:r>
+        <w:rPr>
+          <w:sz w:val="28"/>
+          <w:szCs w:val="28"/>
+        </w:rPr>
+        <w:t xml:space="preserve"> Piece</w:t>
       </w:r>
       <w:r>
         <w:rPr>
@@ -2116,6 +2593,7 @@
         </w:rPr>
         <w:t xml:space="preserve"> com cada facção Marinha, </w:t>
       </w:r>
+      <w:proofErr w:type="gramStart"/>
       <w:r>
         <w:rPr>
           <w:sz w:val="28"/>
@@ -2123,6 +2601,7 @@
         </w:rPr>
         <w:t>Revolucionários</w:t>
       </w:r>
+      <w:proofErr w:type="gramEnd"/>
       <w:r>
         <w:rPr>
           <w:sz w:val="28"/>
@@ -2249,6 +2728,7 @@
         </w:rPr>
         <w:t xml:space="preserve">Quando </w:t>
       </w:r>
+      <w:proofErr w:type="spellStart"/>
       <w:r>
         <w:rPr>
           <w:sz w:val="28"/>
@@ -2261,7 +2741,31 @@
           <w:sz w:val="28"/>
           <w:szCs w:val="28"/>
         </w:rPr>
-        <w:t>ne piece entrou na minha vida?</w:t>
+        <w:t>ne</w:t>
+      </w:r>
+      <w:proofErr w:type="spellEnd"/>
+      <w:r>
+        <w:rPr>
+          <w:sz w:val="28"/>
+          <w:szCs w:val="28"/>
+        </w:rPr>
+        <w:t xml:space="preserve"> </w:t>
+      </w:r>
+      <w:proofErr w:type="spellStart"/>
+      <w:r>
+        <w:rPr>
+          <w:sz w:val="28"/>
+          <w:szCs w:val="28"/>
+        </w:rPr>
+        <w:t>piece</w:t>
+      </w:r>
+      <w:proofErr w:type="spellEnd"/>
+      <w:r>
+        <w:rPr>
+          <w:sz w:val="28"/>
+          <w:szCs w:val="28"/>
+        </w:rPr>
+        <w:t xml:space="preserve"> entrou na minha vida?</w:t>
       </w:r>
     </w:p>
     <w:p>
@@ -2279,6 +2783,7 @@
         </w:rPr>
         <w:t xml:space="preserve">O anime </w:t>
       </w:r>
+      <w:proofErr w:type="spellStart"/>
       <w:r>
         <w:rPr>
           <w:sz w:val="28"/>
@@ -2291,7 +2796,31 @@
           <w:sz w:val="28"/>
           <w:szCs w:val="28"/>
         </w:rPr>
-        <w:t>ne piece entrou na minha vida em 2018, quando um amigo me apresentou</w:t>
+        <w:t>ne</w:t>
+      </w:r>
+      <w:proofErr w:type="spellEnd"/>
+      <w:r>
+        <w:rPr>
+          <w:sz w:val="28"/>
+          <w:szCs w:val="28"/>
+        </w:rPr>
+        <w:t xml:space="preserve"> </w:t>
+      </w:r>
+      <w:proofErr w:type="spellStart"/>
+      <w:r>
+        <w:rPr>
+          <w:sz w:val="28"/>
+          <w:szCs w:val="28"/>
+        </w:rPr>
+        <w:t>piece</w:t>
+      </w:r>
+      <w:proofErr w:type="spellEnd"/>
+      <w:r>
+        <w:rPr>
+          <w:sz w:val="28"/>
+          <w:szCs w:val="28"/>
+        </w:rPr>
+        <w:t xml:space="preserve"> entrou na minha vida em 2018, quando um amigo me apresentou</w:t>
       </w:r>
       <w:r>
         <w:rPr>
@@ -2312,7 +2841,25 @@
           <w:sz w:val="28"/>
           <w:szCs w:val="28"/>
         </w:rPr>
-        <w:t>parte da historia contada para mim, mesmo que pequen</w:t>
+        <w:t xml:space="preserve">parte da </w:t>
+      </w:r>
+      <w:proofErr w:type="spellStart"/>
+      <w:proofErr w:type="gramStart"/>
+      <w:r>
+        <w:rPr>
+          <w:sz w:val="28"/>
+          <w:szCs w:val="28"/>
+        </w:rPr>
+        <w:t>historia</w:t>
+      </w:r>
+      <w:proofErr w:type="spellEnd"/>
+      <w:proofErr w:type="gramEnd"/>
+      <w:r>
+        <w:rPr>
+          <w:sz w:val="28"/>
+          <w:szCs w:val="28"/>
+        </w:rPr>
+        <w:t xml:space="preserve"> contada para mim, mesmo que pequen</w:t>
       </w:r>
       <w:r>
         <w:rPr>
@@ -2464,6 +3011,7 @@
         </w:rPr>
         <w:t xml:space="preserve">A maior dificuldade que passei e </w:t>
       </w:r>
+      <w:proofErr w:type="spellStart"/>
       <w:r>
         <w:rPr>
           <w:sz w:val="28"/>
@@ -2476,7 +3024,31 @@
           <w:sz w:val="28"/>
           <w:szCs w:val="28"/>
         </w:rPr>
-        <w:t xml:space="preserve">ne piece me acompanhou foi exatamente na época </w:t>
+        <w:t>ne</w:t>
+      </w:r>
+      <w:proofErr w:type="spellEnd"/>
+      <w:r>
+        <w:rPr>
+          <w:sz w:val="28"/>
+          <w:szCs w:val="28"/>
+        </w:rPr>
+        <w:t xml:space="preserve"> </w:t>
+      </w:r>
+      <w:proofErr w:type="spellStart"/>
+      <w:r>
+        <w:rPr>
+          <w:sz w:val="28"/>
+          <w:szCs w:val="28"/>
+        </w:rPr>
+        <w:t>piece</w:t>
+      </w:r>
+      <w:proofErr w:type="spellEnd"/>
+      <w:r>
+        <w:rPr>
+          <w:sz w:val="28"/>
+          <w:szCs w:val="28"/>
+        </w:rPr>
+        <w:t xml:space="preserve"> me acompanhou foi exatamente na época </w:t>
       </w:r>
       <w:r>
         <w:rPr>
@@ -2505,7 +3077,23 @@
           <w:sz w:val="28"/>
           <w:szCs w:val="28"/>
         </w:rPr>
-        <w:t>, onde deixei de falar com muitas pessoas e fazer muitas coisas que gostava, tendo um episodio onde ficava mais na cama</w:t>
+        <w:t xml:space="preserve">, onde deixei de falar com muitas pessoas e fazer muitas coisas que gostava, tendo um </w:t>
+      </w:r>
+      <w:proofErr w:type="spellStart"/>
+      <w:r>
+        <w:rPr>
+          <w:sz w:val="28"/>
+          <w:szCs w:val="28"/>
+        </w:rPr>
+        <w:t>episodio</w:t>
+      </w:r>
+      <w:proofErr w:type="spellEnd"/>
+      <w:r>
+        <w:rPr>
+          <w:sz w:val="28"/>
+          <w:szCs w:val="28"/>
+        </w:rPr>
+        <w:t xml:space="preserve"> onde ficava mais na cama</w:t>
       </w:r>
       <w:r>
         <w:rPr>
@@ -2583,7 +3171,23 @@
           <w:sz w:val="28"/>
           <w:szCs w:val="28"/>
         </w:rPr>
-        <w:t xml:space="preserve">A maior superação na realização deste desafio foi conseguir me curar desta doença que envolve vários estigmas e poder olhar pra </w:t>
+        <w:t xml:space="preserve">A maior superação na realização deste desafio foi conseguir me curar desta doença que envolve vários estigmas e poder olhar </w:t>
+      </w:r>
+      <w:proofErr w:type="gramStart"/>
+      <w:r>
+        <w:rPr>
+          <w:sz w:val="28"/>
+          <w:szCs w:val="28"/>
+        </w:rPr>
+        <w:t>pra</w:t>
+      </w:r>
+      <w:proofErr w:type="gramEnd"/>
+      <w:r>
+        <w:rPr>
+          <w:sz w:val="28"/>
+          <w:szCs w:val="28"/>
+        </w:rPr>
+        <w:t xml:space="preserve"> </w:t>
       </w:r>
       <w:r>
         <w:rPr>
@@ -2613,6 +3217,7 @@
         </w:rPr>
         <w:t xml:space="preserve"> com a psicologia, conseguir lutar para não voltar para esse mesmo local. Porém a obra </w:t>
       </w:r>
+      <w:proofErr w:type="spellStart"/>
       <w:r>
         <w:rPr>
           <w:sz w:val="28"/>
@@ -2625,7 +3230,47 @@
           <w:sz w:val="28"/>
           <w:szCs w:val="28"/>
         </w:rPr>
-        <w:t xml:space="preserve">ne piece teve grande influencia nisso pois, durante uma época era a única coisa que me deixava feliz e animado para continuar vivendo e vivenciando o anime, </w:t>
+        <w:t>ne</w:t>
+      </w:r>
+      <w:proofErr w:type="spellEnd"/>
+      <w:r>
+        <w:rPr>
+          <w:sz w:val="28"/>
+          <w:szCs w:val="28"/>
+        </w:rPr>
+        <w:t xml:space="preserve"> </w:t>
+      </w:r>
+      <w:proofErr w:type="spellStart"/>
+      <w:r>
+        <w:rPr>
+          <w:sz w:val="28"/>
+          <w:szCs w:val="28"/>
+        </w:rPr>
+        <w:t>piece</w:t>
+      </w:r>
+      <w:proofErr w:type="spellEnd"/>
+      <w:r>
+        <w:rPr>
+          <w:sz w:val="28"/>
+          <w:szCs w:val="28"/>
+        </w:rPr>
+        <w:t xml:space="preserve"> teve grande </w:t>
+      </w:r>
+      <w:proofErr w:type="spellStart"/>
+      <w:r>
+        <w:rPr>
+          <w:sz w:val="28"/>
+          <w:szCs w:val="28"/>
+        </w:rPr>
+        <w:t>influencia</w:t>
+      </w:r>
+      <w:proofErr w:type="spellEnd"/>
+      <w:r>
+        <w:rPr>
+          <w:sz w:val="28"/>
+          <w:szCs w:val="28"/>
+        </w:rPr>
+        <w:t xml:space="preserve"> nisso pois, durante uma época era a única coisa que me deixava feliz e animado para continuar vivendo e vivenciando o anime, </w:t>
       </w:r>
       <w:r>
         <w:rPr>
@@ -2639,7 +3284,23 @@
           <w:sz w:val="28"/>
           <w:szCs w:val="28"/>
         </w:rPr>
-        <w:t xml:space="preserve"> por tratar de questões reais o personagem principal Luffy me inspirou muito com seu jeito de levar a vida prezando a liberdade, fazer as coisas que sonhamos independente do resultado ou de julgamentos</w:t>
+        <w:t xml:space="preserve"> por tratar de questões reais o personagem principal </w:t>
+      </w:r>
+      <w:proofErr w:type="spellStart"/>
+      <w:r>
+        <w:rPr>
+          <w:sz w:val="28"/>
+          <w:szCs w:val="28"/>
+        </w:rPr>
+        <w:t>Luffy</w:t>
+      </w:r>
+      <w:proofErr w:type="spellEnd"/>
+      <w:r>
+        <w:rPr>
+          <w:sz w:val="28"/>
+          <w:szCs w:val="28"/>
+        </w:rPr>
+        <w:t xml:space="preserve"> me inspirou muito com seu jeito de levar a vida prezando a liberdade, fazer as coisas que sonhamos independente do resultado ou de julgamentos</w:t>
       </w:r>
       <w:r>
         <w:rPr>
@@ -2681,7 +3342,23 @@
           <w:sz w:val="28"/>
           <w:szCs w:val="28"/>
         </w:rPr>
-        <w:t xml:space="preserve"> o fechamento de todos esses personagens e historia que acompanho</w:t>
+        <w:t xml:space="preserve"> o fechamento de todos esses personagens e </w:t>
+      </w:r>
+      <w:proofErr w:type="spellStart"/>
+      <w:r>
+        <w:rPr>
+          <w:sz w:val="28"/>
+          <w:szCs w:val="28"/>
+        </w:rPr>
+        <w:t>historia</w:t>
+      </w:r>
+      <w:proofErr w:type="spellEnd"/>
+      <w:r>
+        <w:rPr>
+          <w:sz w:val="28"/>
+          <w:szCs w:val="28"/>
+        </w:rPr>
+        <w:t xml:space="preserve"> que acompanho</w:t>
       </w:r>
       <w:r>
         <w:rPr>
@@ -3200,7 +3877,23 @@
           <w:sz w:val="28"/>
           <w:szCs w:val="28"/>
         </w:rPr>
-        <w:t xml:space="preserve"> de um site com tema do anime One Piece.</w:t>
+        <w:t xml:space="preserve"> de um site com tema do anime </w:t>
+      </w:r>
+      <w:proofErr w:type="spellStart"/>
+      <w:r>
+        <w:rPr>
+          <w:sz w:val="28"/>
+          <w:szCs w:val="28"/>
+        </w:rPr>
+        <w:t>One</w:t>
+      </w:r>
+      <w:proofErr w:type="spellEnd"/>
+      <w:r>
+        <w:rPr>
+          <w:sz w:val="28"/>
+          <w:szCs w:val="28"/>
+        </w:rPr>
+        <w:t xml:space="preserve"> Piece.</w:t>
       </w:r>
     </w:p>
     <w:p>
@@ -3549,12 +4242,21 @@
           <w:szCs w:val="28"/>
         </w:rPr>
       </w:pPr>
-      <w:r>
-        <w:rPr>
-          <w:sz w:val="28"/>
-          <w:szCs w:val="28"/>
-        </w:rPr>
-        <w:t xml:space="preserve">Navbar com links para acesso </w:t>
+      <w:proofErr w:type="spellStart"/>
+      <w:r>
+        <w:rPr>
+          <w:sz w:val="28"/>
+          <w:szCs w:val="28"/>
+        </w:rPr>
+        <w:t>Navbar</w:t>
+      </w:r>
+      <w:proofErr w:type="spellEnd"/>
+      <w:r>
+        <w:rPr>
+          <w:sz w:val="28"/>
+          <w:szCs w:val="28"/>
+        </w:rPr>
+        <w:t xml:space="preserve"> com links para acesso </w:t>
       </w:r>
       <w:r>
         <w:rPr>
@@ -4076,12 +4778,21 @@
           <w:szCs w:val="28"/>
         </w:rPr>
       </w:pPr>
-      <w:r>
-        <w:rPr>
-          <w:sz w:val="28"/>
-          <w:szCs w:val="28"/>
-        </w:rPr>
-        <w:t>Grafico de pizza e de colunas</w:t>
+      <w:proofErr w:type="spellStart"/>
+      <w:r>
+        <w:rPr>
+          <w:sz w:val="28"/>
+          <w:szCs w:val="28"/>
+        </w:rPr>
+        <w:t>Grafico</w:t>
+      </w:r>
+      <w:proofErr w:type="spellEnd"/>
+      <w:r>
+        <w:rPr>
+          <w:sz w:val="28"/>
+          <w:szCs w:val="28"/>
+        </w:rPr>
+        <w:t xml:space="preserve"> de pizza e de colunas</w:t>
       </w:r>
     </w:p>
     <w:p>
@@ -4275,7 +4986,23 @@
           <w:sz w:val="28"/>
           <w:szCs w:val="28"/>
         </w:rPr>
-        <w:t>terá como tema principal o anime One Piece.</w:t>
+        <w:t xml:space="preserve">terá como tema principal o anime </w:t>
+      </w:r>
+      <w:proofErr w:type="spellStart"/>
+      <w:r>
+        <w:rPr>
+          <w:sz w:val="28"/>
+          <w:szCs w:val="28"/>
+        </w:rPr>
+        <w:t>One</w:t>
+      </w:r>
+      <w:proofErr w:type="spellEnd"/>
+      <w:r>
+        <w:rPr>
+          <w:sz w:val="28"/>
+          <w:szCs w:val="28"/>
+        </w:rPr>
+        <w:t xml:space="preserve"> Piece.</w:t>
       </w:r>
     </w:p>
     <w:p>
@@ -4489,7 +5216,23 @@
           <w:sz w:val="28"/>
           <w:szCs w:val="28"/>
         </w:rPr>
-        <w:t>Será tema do site um único anime, sendo este One Piece.</w:t>
+        <w:t xml:space="preserve">Será tema do site um único anime, sendo este </w:t>
+      </w:r>
+      <w:proofErr w:type="spellStart"/>
+      <w:r>
+        <w:rPr>
+          <w:sz w:val="28"/>
+          <w:szCs w:val="28"/>
+        </w:rPr>
+        <w:t>One</w:t>
+      </w:r>
+      <w:proofErr w:type="spellEnd"/>
+      <w:r>
+        <w:rPr>
+          <w:sz w:val="28"/>
+          <w:szCs w:val="28"/>
+        </w:rPr>
+        <w:t xml:space="preserve"> Piece.</w:t>
       </w:r>
     </w:p>
     <w:p>
@@ -4536,6 +5279,66 @@
     </w:p>
     <w:p>
       <w:pPr>
+        <w:ind w:left="708"/>
+        <w:jc w:val="both"/>
+        <w:rPr>
+          <w:sz w:val="28"/>
+          <w:szCs w:val="28"/>
+        </w:rPr>
+      </w:pPr>
+      <w:r>
+        <w:rPr>
+          <w:b/>
+          <w:bCs/>
+          <w:sz w:val="36"/>
+          <w:szCs w:val="36"/>
+        </w:rPr>
+        <w:t>10.Diagrama</w:t>
+      </w:r>
+      <w:r>
+        <w:rPr>
+          <w:sz w:val="28"/>
+          <w:szCs w:val="28"/>
+        </w:rPr>
+        <w:drawing>
+          <wp:inline distT="0" distB="0" distL="0" distR="0" wp14:anchorId="0126E669" wp14:editId="21418F5B">
+            <wp:extent cx="4701540" cy="3999405"/>
+            <wp:effectExtent l="0" t="0" r="3810" b="1270"/>
+            <wp:docPr id="2102195301" name="Imagem 1" descr="Diagrama&#10;&#10;O conteúdo gerado por IA pode estar incorreto."/>
+            <wp:cNvGraphicFramePr>
+              <a:graphicFrameLocks xmlns:a="http://schemas.openxmlformats.org/drawingml/2006/main" noChangeAspect="1"/>
+            </wp:cNvGraphicFramePr>
+            <a:graphic xmlns:a="http://schemas.openxmlformats.org/drawingml/2006/main">
+              <a:graphicData uri="http://schemas.openxmlformats.org/drawingml/2006/picture">
+                <pic:pic xmlns:pic="http://schemas.openxmlformats.org/drawingml/2006/picture">
+                  <pic:nvPicPr>
+                    <pic:cNvPr id="2102195301" name="Imagem 1" descr="Diagrama&#10;&#10;O conteúdo gerado por IA pode estar incorreto."/>
+                    <pic:cNvPicPr/>
+                  </pic:nvPicPr>
+                  <pic:blipFill>
+                    <a:blip r:embed="rId8"/>
+                    <a:stretch>
+                      <a:fillRect/>
+                    </a:stretch>
+                  </pic:blipFill>
+                  <pic:spPr>
+                    <a:xfrm>
+                      <a:off x="0" y="0"/>
+                      <a:ext cx="4702095" cy="3999877"/>
+                    </a:xfrm>
+                    <a:prstGeom prst="rect">
+                      <a:avLst/>
+                    </a:prstGeom>
+                  </pic:spPr>
+                </pic:pic>
+              </a:graphicData>
+            </a:graphic>
+          </wp:inline>
+        </w:drawing>
+      </w:r>
+    </w:p>
+    <w:p>
+      <w:pPr>
         <w:jc w:val="both"/>
       </w:pPr>
     </w:p>
@@ -4603,7 +5406,7 @@
           <w:szCs w:val="28"/>
         </w:rPr>
       </w:pPr>
-      <w:hyperlink r:id="rId8" w:history="1">
+      <w:hyperlink r:id="rId9" w:history="1">
         <w:r>
           <w:rPr>
             <w:rStyle w:val="Hyperlink"/>
@@ -4626,7 +5429,7 @@
           <w:szCs w:val="28"/>
         </w:rPr>
       </w:pPr>
-      <w:hyperlink r:id="rId9" w:history="1">
+      <w:hyperlink r:id="rId10" w:history="1">
         <w:r>
           <w:rPr>
             <w:rStyle w:val="Hyperlink"/>
@@ -4649,7 +5452,7 @@
           <w:szCs w:val="28"/>
         </w:rPr>
       </w:pPr>
-      <w:hyperlink r:id="rId10" w:history="1">
+      <w:hyperlink r:id="rId11" w:history="1">
         <w:r>
           <w:rPr>
             <w:rStyle w:val="Hyperlink"/>
@@ -4672,7 +5475,7 @@
           <w:szCs w:val="28"/>
         </w:rPr>
       </w:pPr>
-      <w:hyperlink r:id="rId11" w:history="1">
+      <w:hyperlink r:id="rId12" w:history="1">
         <w:r>
           <w:rPr>
             <w:rStyle w:val="Hyperlink"/>
@@ -4695,7 +5498,7 @@
           <w:szCs w:val="28"/>
         </w:rPr>
       </w:pPr>
-      <w:hyperlink r:id="rId12" w:history="1">
+      <w:hyperlink r:id="rId13" w:history="1">
         <w:r>
           <w:rPr>
             <w:rStyle w:val="Hyperlink"/>

</xml_diff>